<commit_message>
docs: correct endpoint, table and route counts across the document set
Verified against the source: 17 tables, 62 endpoints, 31 client routes over 27
page modules. These are figures a reviewer will check, so they are now derived
from the code rather than estimated.

Co-Authored-By: Claude Opus 5 <noreply@anthropic.com>
</commit_message>
<xml_diff>
--- a/docs/AVSAR_Design_Document_v1.0.docx
+++ b/docs/AVSAR_Design_Document_v1.0.docx
@@ -612,7 +612,7 @@
                 <w:color w:val="344054"/>
                 <w:sz w:val="19"/>
               </w:rPr>
-              <w:t>Baseline. Sixteen-table data model, four state machines, seven roles, forty-six endpoints, twenty-four client routes.</w:t>
+              <w:t>Baseline. Seventeen-table data model, four state machines, seven roles, sixty-two endpoints, thirty-one client routes.</w:t>
             </w:r>
           </w:p>
         </w:tc>
@@ -1615,7 +1615,7 @@
     </w:p>
     <w:p>
       <w:r>
-        <w:t>Sixteen tables. Foreign keys are enforced, write-ahead logging is on, and every JSON-valued column is documented in the schema comment beside it.</w:t>
+        <w:t>Seventeen tables. Foreign keys are enforced, write-ahead logging is on, and every JSON-valued column is documented in the schema comment beside it.</w:t>
       </w:r>
     </w:p>
     <w:p>
@@ -5130,7 +5130,7 @@
     </w:p>
     <w:p>
       <w:r>
-        <w:t>Twenty-four routes, eight public and sixteen authenticated, guarded by a role-aware wrapper that redirects rather than rendering a forbidden view. All endpoint URLs live in one map so no component contains a URL string. Navigation is derived from the role predicate, so a user never sees a link to something the server would refuse.</w:t>
+        <w:t>Thirty-one routes, ten public and twenty-one authenticated, guarded by a role-aware wrapper that redirects rather than rendering a forbidden view. All endpoint URLs live in one map so no component contains a URL string. Navigation is derived from the role predicate, so a user never sees a link to something the server would refuse.</w:t>
       </w:r>
     </w:p>
     <w:p>

</xml_diff>